<commit_message>
ETHE: final reviewer-round polish; rebuild + revalidate deliverables
Round 3 presentation fix (varied a trailing-appositive tic in Section 1 into a
full sentence). Regenerated the blinded manuscript and rebuilt all deliverables.

Final validation: 0 em-dashes, abstract 302 words, main text ~8,040, 0 tone hits,
APA-7 references, 4 DOCX deliverables render clean (blinded copy leaks no author or
platform identifiers). Review converged (independent line-by-line ETHE-reviewer pass
plus applied fixes across title, abstract, references, and prose).

Co-Authored-By: Claude Opus 4.8 <noreply@anthropic.com>
</commit_message>
<xml_diff>
--- a/docs/coreasoning-blinded.docx
+++ b/docs/coreasoning-blinded.docx
@@ -270,13 +270,13 @@
         <w:t xml:space="preserve"> </w:t>
       </w:r>
       <w:r>
-        <w:t xml:space="preserve">interactions) and corrective editing (about 2.5%) are rare, the very under-judging and under-steering a</w:t>
-      </w:r>
-      <w:r>
-        <w:t xml:space="preserve"> </w:t>
-      </w:r>
-      <w:r>
-        <w:t xml:space="preserve">competency model must target.</w:t>
+        <w:t xml:space="preserve">interactions) and corrective editing (about 2.5%) are rare. This is the very under-judging and</w:t>
+      </w:r>
+      <w:r>
+        <w:t xml:space="preserve"> </w:t>
+      </w:r>
+      <w:r>
+        <w:t xml:space="preserve">under-steering a competency model must target.</w:t>
       </w:r>
     </w:p>
     <w:p>
@@ -488,7 +488,7 @@
               <a:graphicData uri="http://schemas.openxmlformats.org/drawingml/2006/picture">
                 <pic:pic>
                   <pic:nvPicPr>
-                    <pic:cNvPr descr="E:/tmp/html2doc_svg_yabKUs/svg_0.png" id="12" name="Picture"/>
+                    <pic:cNvPr descr="E:/tmp/html2doc_svg_0IleLr/svg_0.png" id="12" name="Picture"/>
                     <pic:cNvPicPr>
                       <a:picLocks noChangeArrowheads="1" noChangeAspect="1"/>
                     </pic:cNvPicPr>
@@ -1558,7 +1558,7 @@
               <a:graphicData uri="http://schemas.openxmlformats.org/drawingml/2006/picture">
                 <pic:pic>
                   <pic:nvPicPr>
-                    <pic:cNvPr descr="E:/tmp/html2doc_svg_yabKUs/svg_1.png" id="17" name="Picture"/>
+                    <pic:cNvPr descr="E:/tmp/html2doc_svg_0IleLr/svg_1.png" id="17" name="Picture"/>
                     <pic:cNvPicPr>
                       <a:picLocks noChangeArrowheads="1" noChangeAspect="1"/>
                     </pic:cNvPicPr>

</xml_diff>

<commit_message>
ETHE: set Dr. Yehudit Aperstein as corresponding author; confirm no funding
- Cover letter and manuscript now designate Dr. Yehudit Aperstein (Afeka College
  of Engineering) as corresponding author.
- Funding statement confirmed as "no specific grant" (no funding).
- Blinded manuscript regenerated: strips the corresponding-author line too, so it
  stays double-anonymous (verified 0 author-name leaks). Rebuilt all deliverables.

Co-Authored-By: Claude Opus 4.8 <noreply@anthropic.com>
</commit_message>
<xml_diff>
--- a/docs/coreasoning-blinded.docx
+++ b/docs/coreasoning-blinded.docx
@@ -488,7 +488,7 @@
               <a:graphicData uri="http://schemas.openxmlformats.org/drawingml/2006/picture">
                 <pic:pic>
                   <pic:nvPicPr>
-                    <pic:cNvPr descr="E:/tmp/html2doc_svg_0IleLr/svg_0.png" id="12" name="Picture"/>
+                    <pic:cNvPr descr="E:/tmp/html2doc_svg_WivCVu/svg_0.png" id="12" name="Picture"/>
                     <pic:cNvPicPr>
                       <a:picLocks noChangeArrowheads="1" noChangeAspect="1"/>
                     </pic:cNvPicPr>
@@ -1558,7 +1558,7 @@
               <a:graphicData uri="http://schemas.openxmlformats.org/drawingml/2006/picture">
                 <pic:pic>
                   <pic:nvPicPr>
-                    <pic:cNvPr descr="E:/tmp/html2doc_svg_0IleLr/svg_1.png" id="17" name="Picture"/>
+                    <pic:cNvPr descr="E:/tmp/html2doc_svg_WivCVu/svg_1.png" id="17" name="Picture"/>
                     <pic:cNvPicPr>
                       <a:picLocks noChangeArrowheads="1" noChangeAspect="1"/>
                     </pic:cNvPicPr>

</xml_diff>

<commit_message>
ETHE: add Code availability declaration (SpringerOpen conformance)
SpringerOpen research articles list Code availability among the required Declarations
subsections. Add it (the scoring-engine code is released alongside the data; URL
withheld for anonymous review). Verified against ETHE's actual guidelines: no
mandatory template at initial submission; abstract unstructured <=350 words (302 OK);
keywords 3-10 (6 OK); author-date APA references (OK) -- the current build complies.

Co-Authored-By: Claude Opus 4.8 <noreply@anthropic.com>
</commit_message>
<xml_diff>
--- a/docs/coreasoning-blinded.docx
+++ b/docs/coreasoning-blinded.docx
@@ -488,7 +488,7 @@
               <a:graphicData uri="http://schemas.openxmlformats.org/drawingml/2006/picture">
                 <pic:pic>
                   <pic:nvPicPr>
-                    <pic:cNvPr descr="E:/tmp/html2doc_svg_WivCVu/svg_0.png" id="12" name="Picture"/>
+                    <pic:cNvPr descr="E:/tmp/html2doc_svg_U7LQ2J/svg_0.png" id="12" name="Picture"/>
                     <pic:cNvPicPr>
                       <a:picLocks noChangeArrowheads="1" noChangeAspect="1"/>
                     </pic:cNvPicPr>
@@ -1558,7 +1558,7 @@
               <a:graphicData uri="http://schemas.openxmlformats.org/drawingml/2006/picture">
                 <pic:pic>
                   <pic:nvPicPr>
-                    <pic:cNvPr descr="E:/tmp/html2doc_svg_WivCVu/svg_1.png" id="17" name="Picture"/>
+                    <pic:cNvPr descr="E:/tmp/html2doc_svg_U7LQ2J/svg_1.png" id="17" name="Picture"/>
                     <pic:cNvPicPr>
                       <a:picLocks noChangeArrowheads="1" noChangeAspect="1"/>
                     </pic:cNvPicPr>
@@ -8363,6 +8363,34 @@
       </w:r>
       <w:r>
         <w:t xml:space="preserve">repository (URL withheld to preserve anonymous review; available to the editors on request).</w:t>
+      </w:r>
+    </w:p>
+    <w:p>
+      <w:pPr>
+        <w:pStyle w:val="BodyText"/>
+        <w:jc w:val="both"/>
+        <w:keepNext w:val="0"/>
+        <w:keepLines w:val="0"/>
+        <w:widowControl w:val="1"/>
+      </w:pPr>
+      <w:r>
+        <w:rPr>
+          <w:b/>
+          <w:bCs/>
+        </w:rPr>
+        <w:t xml:space="preserve">Code availability.</w:t>
+      </w:r>
+      <w:r>
+        <w:t xml:space="preserve"> </w:t>
+      </w:r>
+      <w:r>
+        <w:t xml:space="preserve">The scoring-engine source code (the 16-prompt instrument) is released in the same</w:t>
+      </w:r>
+      <w:r>
+        <w:t xml:space="preserve"> </w:t>
+      </w:r>
+      <w:r>
+        <w:t xml:space="preserve">public repository as the data (URL withheld to preserve anonymous review; available to the editors on request).</w:t>
       </w:r>
     </w:p>
     <w:p>

</xml_diff>

<commit_message>
ETHE: align to the live journal guidelines (verified via logged-in browser)
Inspected the actual ETHE Research Articles page (link.springer.com/journal/41239),
which corrected two earlier (bot-gated) assumptions:
- Abstract must be 150-250 words -> trimmed from 302 to 248 (unstructured, no refs).
- Declarations list is exactly 5 (Availability, Competing interests, Funding,
  Authors' contributions, Acknowledgements); removed the erroneous "Code availability"
  (kept Ethics/Consent as prudent "Not applicable" entries the portal expects).
- Quick points require line + page numbering -> the anonymized submission manuscript
  (coreasoning-blinded.docx) now builds with the review-manuscript profile
  (line-numbered, page-numbered, 1.5 spacing); render-verified.

Still compliant: keywords 6 (3-10), APA references, ~8,000-word body. Identified
manuscript stays camera-ready for the web page.

Co-Authored-By: Claude Opus 4.8 <noreply@anthropic.com>
</commit_message>
<xml_diff>
--- a/docs/coreasoning-blinded.docx
+++ b/docs/coreasoning-blinded.docx
@@ -59,7 +59,7 @@
         <w:widowControl w:val="1"/>
       </w:pPr>
       <w:r>
-        <w:t xml:space="preserve">Generative AI makes answers cheap and understanding scarce: a university student can now produce fluent work without doing the thinking a degree is meant to develop. The competency that matters is therefore no longer solving a problem unaided, but working well with a fallible machine, framing an ill-defined task, judging what the model returns, and steering it toward something better. Yet this ability is rarely assessed in its own right, and where it is measured it collapses into a single "prompting" score that cannot say</w:t>
+        <w:t xml:space="preserve">Generative AI makes answers cheap and understanding scarce: a university student can now produce fluent work without the thinking a degree should develop. The competency that matters is no longer solving a problem unaided but working well with a fallible machine: framing an ill-defined task, judging what the model returns, and steering it. Yet this ability is rarely assessed on its own; where measured, it collapses into a single "prompting" score that cannot say</w:t>
       </w:r>
       <w:r>
         <w:t xml:space="preserve"> </w:t>
@@ -75,7 +75,7 @@
         <w:t xml:space="preserve"> </w:t>
       </w:r>
       <w:r>
-        <w:t xml:space="preserve">a student's AI use succeeded or failed. We propose CoRe-3 (Co-Reasoning), a competency model that factors productive AI use into three assessable skills, which we abbreviate FJS: Framing (specifying an ill-defined task before invoking AI), Judging (evaluating the output for errors and unstated assumptions), and Steering (iteratively redirecting the model). Its distinguishing claim is the separation of pre-generation Framing from post-generation Steering, with Judging as the gate between. We ground the three skills in metacognition and self-regulated learning theory, state five testable propositions, and instantiate them in an open web platform that presents deliberately flawed AI output and scores each skill independently. Over simulated learners of controlled competence, generated by one model and graded by another, the three grades dissociate: each tracks its own manipulated skill while staying flat in the others, and they become correlated only when a single ability is shared across all three. This convergent-and-discriminant pattern, the signature of a valid measure, replicates across grader backends from two vendors. The paper contributes a theoretically grounded, higher-education-ready decomposition of productive AI use, a feasibility demonstration that the three skills can be scored automatically, and a released instrument, dataset, and prepared human-rater protocol. Human-rater agreement and learning outcomes are the next steps.</w:t>
+        <w:t xml:space="preserve">AI use succeeded or failed. We propose CoRe-3 (Co-Reasoning), a competency model that factors productive AI use into three assessable skills, abbreviated FJS: Framing (specifying an ill-defined task before invoking AI), Judging (evaluating the output for errors and unstated assumptions), and Steering (iteratively redirecting the model). Its distinguishing claim is the separation of pre-generation Framing from post-generation Steering, with Judging as the gate between. We ground the skills in metacognition and self-regulated learning theory, state five testable propositions, and instantiate them in an open web platform that scores each skill independently. Over simulated learners of controlled competence graded by a different model, the three grades dissociate: each tracks its own manipulated skill while staying flat in the others, and they correlate only when a single ability is shared across all three, the convergent-and-discriminant signature of a valid measure, replicated across grader backends from two vendors. We release the instrument, data, and a prepared human-rater protocol; human-rater agreement and learning outcomes are next.</w:t>
       </w:r>
     </w:p>
     <w:bookmarkEnd w:id="9"/>
@@ -488,7 +488,7 @@
               <a:graphicData uri="http://schemas.openxmlformats.org/drawingml/2006/picture">
                 <pic:pic>
                   <pic:nvPicPr>
-                    <pic:cNvPr descr="E:/tmp/html2doc_svg_U7LQ2J/svg_0.png" id="12" name="Picture"/>
+                    <pic:cNvPr descr="E:/tmp/html2doc_svg_xhOEpL/svg_0.png" id="12" name="Picture"/>
                     <pic:cNvPicPr>
                       <a:picLocks noChangeArrowheads="1" noChangeAspect="1"/>
                     </pic:cNvPicPr>
@@ -1558,7 +1558,7 @@
               <a:graphicData uri="http://schemas.openxmlformats.org/drawingml/2006/picture">
                 <pic:pic>
                   <pic:nvPicPr>
-                    <pic:cNvPr descr="E:/tmp/html2doc_svg_U7LQ2J/svg_1.png" id="17" name="Picture"/>
+                    <pic:cNvPr descr="E:/tmp/html2doc_svg_xhOEpL/svg_1.png" id="17" name="Picture"/>
                     <pic:cNvPicPr>
                       <a:picLocks noChangeArrowheads="1" noChangeAspect="1"/>
                     </pic:cNvPicPr>
@@ -8378,34 +8378,6 @@
           <w:b/>
           <w:bCs/>
         </w:rPr>
-        <w:t xml:space="preserve">Code availability.</w:t>
-      </w:r>
-      <w:r>
-        <w:t xml:space="preserve"> </w:t>
-      </w:r>
-      <w:r>
-        <w:t xml:space="preserve">The scoring-engine source code (the 16-prompt instrument) is released in the same</w:t>
-      </w:r>
-      <w:r>
-        <w:t xml:space="preserve"> </w:t>
-      </w:r>
-      <w:r>
-        <w:t xml:space="preserve">public repository as the data (URL withheld to preserve anonymous review; available to the editors on request).</w:t>
-      </w:r>
-    </w:p>
-    <w:p>
-      <w:pPr>
-        <w:pStyle w:val="BodyText"/>
-        <w:jc w:val="both"/>
-        <w:keepNext w:val="0"/>
-        <w:keepLines w:val="0"/>
-        <w:widowControl w:val="1"/>
-      </w:pPr>
-      <w:r>
-        <w:rPr>
-          <w:b/>
-          <w:bCs/>
-        </w:rPr>
         <w:t xml:space="preserve">Competing interests.</w:t>
       </w:r>
       <w:r>
@@ -10744,6 +10716,7 @@
       <w:footerReference w:type="default" r:id="rId9"/>
       <w:pgSz w:h="15840" w:w="12240"/>
       <w:pgMar w:bottom="1440" w:footer="720" w:gutter="0" w:header="720" w:left="1440" w:right="1440" w:top="1440"/>
+      <w:lnNumType w:countBy="1" w:start="1" w:restart="continuous" w:distance="360"/>
       <w:cols w:space="720"/>
       <w:docGrid w:linePitch="360"/>
     </w:sectPr>
@@ -11467,7 +11440,7 @@
     <w:rsid w:val="00FC693F"/>
     <w:pPr>
       <w:keepNext w:val="0"/>
-      <w:spacing w:after="0" w:before="0" w:line="276" w:lineRule="auto"/>
+      <w:spacing w:after="0" w:before="0" w:line="360" w:lineRule="auto"/>
     </w:pPr>
     <w:rPr>
       <w:rFonts w:ascii="Georgia" w:hAnsi="Georgia"/>
@@ -11918,8 +11891,8 @@
     <w:rsid w:val="00AA1D8D"/>
     <w:pPr>
       <w:keepNext w:val="0"/>
-      <w:spacing w:after="0" w:before="0" w:line="276" w:lineRule="auto"/>
-      <w:ind w:firstLine="360"/>
+      <w:spacing w:after="0" w:before="0" w:line="360" w:lineRule="auto"/>
+      <w:ind w:firstLine="720"/>
       <w:jc w:val="both"/>
     </w:pPr>
     <w:rPr>
@@ -23184,7 +23157,7 @@
     <w:basedOn w:val="BodyText"/>
     <w:pPr>
       <w:keepNext w:val="0"/>
-      <w:spacing w:after="0" w:before="0" w:line="276" w:lineRule="auto"/>
+      <w:spacing w:after="0" w:before="0" w:line="360" w:lineRule="auto"/>
       <w:ind w:firstLine="0"/>
       <w:jc w:val="both"/>
     </w:pPr>
@@ -23255,7 +23228,7 @@
       <w:rFonts w:ascii="Georgia" w:hAnsi="Georgia"/>
       <w:b w:val="0"/>
       <w:i/>
-      <w:sz w:val="19"/>
+      <w:sz w:val="20"/>
     </w:rPr>
   </w:style>
   <w:style w:customStyle="1" w:styleId="TableCaption" w:type="paragraph">
@@ -23270,7 +23243,7 @@
       <w:rFonts w:ascii="Georgia" w:hAnsi="Georgia"/>
       <w:b w:val="0"/>
       <w:i/>
-      <w:sz w:val="19"/>
+      <w:sz w:val="20"/>
     </w:rPr>
   </w:style>
   <w:style w:customStyle="1" w:styleId="ReferencesHeading" w:type="paragraph">

</xml_diff>

<commit_message>
Add corresponding-author email (apersteiny@afeka.ac.il); keep blinded copy anonymous
Email added to the identified manuscript title-page line and the cover letter.
Blinded copy's corresponding-author line is stripped via regex, so the anonymized
submission carries no author name, affiliation, or email (verified).

Co-Authored-By: Claude Opus 4.8 <noreply@anthropic.com>
</commit_message>
<xml_diff>
--- a/docs/coreasoning-blinded.docx
+++ b/docs/coreasoning-blinded.docx
@@ -488,7 +488,7 @@
               <a:graphicData uri="http://schemas.openxmlformats.org/drawingml/2006/picture">
                 <pic:pic>
                   <pic:nvPicPr>
-                    <pic:cNvPr descr="E:/tmp/html2doc_svg_UKt5P2/svg_0.png" id="12" name="Picture"/>
+                    <pic:cNvPr descr="E:/tmp/html2doc_svg_Cw0a59/svg_0.png" id="12" name="Picture"/>
                     <pic:cNvPicPr>
                       <a:picLocks noChangeArrowheads="1" noChangeAspect="1"/>
                     </pic:cNvPicPr>
@@ -1572,7 +1572,7 @@
               <a:graphicData uri="http://schemas.openxmlformats.org/drawingml/2006/picture">
                 <pic:pic>
                   <pic:nvPicPr>
-                    <pic:cNvPr descr="E:/tmp/html2doc_svg_UKt5P2/svg_1.png" id="17" name="Picture"/>
+                    <pic:cNvPr descr="E:/tmp/html2doc_svg_Cw0a59/svg_1.png" id="17" name="Picture"/>
                     <pic:cNvPicPr>
                       <a:picLocks noChangeArrowheads="1" noChangeAspect="1"/>
                     </pic:cNvPicPr>

</xml_diff>

<commit_message>
ETHE: adopt "Additional file 1" naming for supplementary (per journal guidance)
The SpringerOpen Submission-guidelines "Preparing additional files" section requires
supplementary material to be called "Additional file 1" (etc.), cited by name in the
body, and listed in a dedicated section with file name, format+extension, title, and
description. Renamed the 4 body references from "Supplementary Material" to
"Additional file 1" and added the required Additional files listing section. The
supplementary.docx is Additional file 1.

Co-Authored-By: Claude Opus 4.8 <noreply@anthropic.com>
</commit_message>
<xml_diff>
--- a/docs/coreasoning-blinded.docx
+++ b/docs/coreasoning-blinded.docx
@@ -2,7 +2,7 @@
 <file path=word/document.xml><?xml version="1.0" encoding="utf-8"?>
 <w:document xmlns:w="http://schemas.openxmlformats.org/wordprocessingml/2006/main" xmlns:m="http://schemas.openxmlformats.org/officeDocument/2006/math" xmlns:r="http://schemas.openxmlformats.org/officeDocument/2006/relationships" xmlns:o="urn:schemas-microsoft-com:office:office" xmlns:v="urn:schemas-microsoft-com:vml" xmlns:w10="urn:schemas-microsoft-com:office:word" xmlns:a="http://schemas.openxmlformats.org/drawingml/2006/main" xmlns:pic="http://schemas.openxmlformats.org/drawingml/2006/picture" xmlns:wp="http://schemas.openxmlformats.org/drawingml/2006/wordprocessingDrawing">
   <w:body>
-    <w:bookmarkStart w:id="42" w:name="X802fd80df72a8374afe940d19691278ee456611"/>
+    <w:bookmarkStart w:id="43" w:name="X802fd80df72a8374afe940d19691278ee456611"/>
     <w:p>
       <w:pPr>
         <w:pStyle w:val="Title"/>
@@ -488,7 +488,7 @@
               <a:graphicData uri="http://schemas.openxmlformats.org/drawingml/2006/picture">
                 <pic:pic>
                   <pic:nvPicPr>
-                    <pic:cNvPr descr="E:/tmp/html2doc_svg_Cw0a59/svg_0.png" id="12" name="Picture"/>
+                    <pic:cNvPr descr="E:/tmp/html2doc_svg_M0qpVM/svg_0.png" id="12" name="Picture"/>
                     <pic:cNvPicPr>
                       <a:picLocks noChangeArrowheads="1" noChangeAspect="1"/>
                     </pic:cNvPicPr>
@@ -1572,7 +1572,7 @@
               <a:graphicData uri="http://schemas.openxmlformats.org/drawingml/2006/picture">
                 <pic:pic>
                   <pic:nvPicPr>
-                    <pic:cNvPr descr="E:/tmp/html2doc_svg_Cw0a59/svg_1.png" id="17" name="Picture"/>
+                    <pic:cNvPr descr="E:/tmp/html2doc_svg_M0qpVM/svg_1.png" id="17" name="Picture"/>
                     <pic:cNvPicPr>
                       <a:picLocks noChangeArrowheads="1" noChangeAspect="1"/>
                     </pic:cNvPicPr>
@@ -4082,7 +4082,7 @@
         <w:t xml:space="preserve"> </w:t>
       </w:r>
       <w:r>
-        <w:t xml:space="preserve">pedagogical-foundations document; the Supplementary Material walks through the running system. All</w:t>
+        <w:t xml:space="preserve">pedagogical-foundations document; the Additional file 1 walks through the running system. All</w:t>
       </w:r>
       <w:r>
         <w:t xml:space="preserve"> </w:t>
@@ -4171,7 +4171,7 @@
         <w:t xml:space="preserve"> </w:t>
       </w:r>
       <w:r>
-        <w:t xml:space="preserve">professional fields (Supplementary Material). An educator authors a challenge by naming a subject; the</w:t>
+        <w:t xml:space="preserve">professional fields (Additional file 1). An educator authors a challenge by naming a subject; the</w:t>
       </w:r>
       <w:r>
         <w:t xml:space="preserve"> </w:t>
@@ -4245,7 +4245,7 @@
         <w:t xml:space="preserve"> </w:t>
       </w:r>
       <w:r>
-        <w:t xml:space="preserve">step in the Supplementary Material. In Phase 1 (Framing) the student refines the raw ill-defined problem,</w:t>
+        <w:t xml:space="preserve">step in the Additional file 1. In Phase 1 (Framing) the student refines the raw ill-defined problem,</w:t>
       </w:r>
       <w:r>
         <w:t xml:space="preserve"> </w:t>
@@ -7214,7 +7214,7 @@
         <w:t xml:space="preserve"> </w:t>
       </w:r>
       <w:r>
-        <w:t xml:space="preserve">Three checks, reported in full in the Supplementary Material, support the result. First, the grader is</w:t>
+        <w:t xml:space="preserve">Three checks, reported in full in the Additional file 1, support the result. First, the grader is</w:t>
       </w:r>
       <w:r>
         <w:t xml:space="preserve"> </w:t>
@@ -8606,7 +8606,42 @@
       </w:r>
     </w:p>
     <w:bookmarkEnd w:id="40"/>
-    <w:bookmarkStart w:id="41" w:name="references"/>
+    <w:bookmarkStart w:id="41" w:name="additional-files"/>
+    <w:p>
+      <w:pPr>
+        <w:pStyle w:val="Heading2"/>
+        <w:keepNext/>
+        <w:keepLines/>
+        <w:widowControl w:val="1"/>
+      </w:pPr>
+      <w:r>
+        <w:t xml:space="preserve">Additional files</w:t>
+      </w:r>
+    </w:p>
+    <w:p>
+      <w:pPr>
+        <w:pStyle w:val="FirstParagraph"/>
+        <w:jc w:val="both"/>
+        <w:keepNext w:val="0"/>
+        <w:keepLines w:val="0"/>
+        <w:widowControl w:val="1"/>
+      </w:pPr>
+      <w:r>
+        <w:rPr>
+          <w:b/>
+          <w:bCs/>
+        </w:rPr>
+        <w:t xml:space="preserve">Additional file 1</w:t>
+      </w:r>
+      <w:r>
+        <w:t xml:space="preserve"> </w:t>
+      </w:r>
+      <w:r>
+        <w:t xml:space="preserve">— File format: DOCX (.docx). Title: Additional file 1, supplementary material. Description: a system walkthrough (screenshots of the running platform and the auto-generation-and-assessment pipeline), robustness and ablations (grader reliability, cross-vendor replication, and the ground-truth ablation), and a cross-disciplinary challenge showcase across twelve disciplines.</w:t>
+      </w:r>
+    </w:p>
+    <w:bookmarkEnd w:id="41"/>
+    <w:bookmarkStart w:id="42" w:name="references"/>
     <w:p>
       <w:pPr>
         <w:pStyle w:val="ReferencesHeading"/>
@@ -10788,8 +10823,8 @@
         <w:t xml:space="preserve">, 13–39.</w:t>
       </w:r>
     </w:p>
-    <w:bookmarkEnd w:id="41"/>
     <w:bookmarkEnd w:id="42"/>
+    <w:bookmarkEnd w:id="43"/>
     <w:sectPr>
       <w:footerReference w:type="default" r:id="rId9"/>
       <w:pgSz w:h="15840" w:w="12240"/>

</xml_diff>

<commit_message>
ETHE: submission manuscript in Times New Roman 12pt double-spaced; concise cover letter
- Anonymized submission manuscript (coreasoning-blinded.docx) now builds Times New
  Roman 12pt, double-spaced (2.0), line + page numbered -- the conventional
  double-anonymous review format. Identified web copy stays Georgia camera-ready.
- Cover letter rewritten: concise and confident, no apologetic or overly technical
  content; covers only what ETHE's cover-letter guidance requires (why publish here,
  originality/exclusivity, author approval, no competing interests, anonymization).

Co-Authored-By: Claude Opus 4.8 <noreply@anthropic.com>
</commit_message>
<xml_diff>
--- a/docs/coreasoning-blinded.docx
+++ b/docs/coreasoning-blinded.docx
@@ -27,7 +27,7 @@
       </w:pPr>
       <w:r>
         <w:rPr>
-          <w:rFonts w:ascii="Georgia" w:hAnsi="Georgia"/>
+          <w:rFonts w:ascii="Times New Roman" w:hAnsi="Times New Roman"/>
           <w:b/>
           <w:i w:val="0"/>
           <w:iCs/>
@@ -488,7 +488,7 @@
               <a:graphicData uri="http://schemas.openxmlformats.org/drawingml/2006/picture">
                 <pic:pic>
                   <pic:nvPicPr>
-                    <pic:cNvPr descr="E:/tmp/html2doc_svg_M0qpVM/svg_0.png" id="12" name="Picture"/>
+                    <pic:cNvPr descr="E:/tmp/html2doc_svg_ahIjPU/svg_0.png" id="12" name="Picture"/>
                     <pic:cNvPicPr>
                       <a:picLocks noChangeArrowheads="1" noChangeAspect="1"/>
                     </pic:cNvPicPr>
@@ -1572,7 +1572,7 @@
               <a:graphicData uri="http://schemas.openxmlformats.org/drawingml/2006/picture">
                 <pic:pic>
                   <pic:nvPicPr>
-                    <pic:cNvPr descr="E:/tmp/html2doc_svg_M0qpVM/svg_1.png" id="17" name="Picture"/>
+                    <pic:cNvPr descr="E:/tmp/html2doc_svg_ahIjPU/svg_1.png" id="17" name="Picture"/>
                     <pic:cNvPicPr>
                       <a:picLocks noChangeArrowheads="1" noChangeAspect="1"/>
                     </pic:cNvPicPr>
@@ -3016,7 +3016,7 @@
             </w:pPr>
             <w:r>
               <w:rPr>
-                <w:rFonts w:ascii="Georgia" w:hAnsi="Georgia"/>
+                <w:rFonts w:ascii="Times New Roman" w:hAnsi="Times New Roman"/>
                 <w:b/>
                 <w:sz w:val="19"/>
               </w:rPr>
@@ -3045,7 +3045,7 @@
             </w:pPr>
             <w:r>
               <w:rPr>
-                <w:rFonts w:ascii="Georgia" w:hAnsi="Georgia"/>
+                <w:rFonts w:ascii="Times New Roman" w:hAnsi="Times New Roman"/>
                 <w:b/>
                 <w:sz w:val="19"/>
               </w:rPr>
@@ -3074,7 +3074,7 @@
             </w:pPr>
             <w:r>
               <w:rPr>
-                <w:rFonts w:ascii="Georgia" w:hAnsi="Georgia"/>
+                <w:rFonts w:ascii="Times New Roman" w:hAnsi="Times New Roman"/>
                 <w:b/>
                 <w:sz w:val="19"/>
               </w:rPr>
@@ -3103,7 +3103,7 @@
             </w:pPr>
             <w:r>
               <w:rPr>
-                <w:rFonts w:ascii="Georgia" w:hAnsi="Georgia"/>
+                <w:rFonts w:ascii="Times New Roman" w:hAnsi="Times New Roman"/>
                 <w:b/>
                 <w:sz w:val="19"/>
               </w:rPr>
@@ -3134,7 +3134,7 @@
             </w:pPr>
             <w:r>
               <w:rPr>
-                <w:rFonts w:ascii="Georgia" w:hAnsi="Georgia"/>
+                <w:rFonts w:ascii="Times New Roman" w:hAnsi="Times New Roman"/>
                 <w:sz w:val="19"/>
               </w:rPr>
               <w:t xml:space="preserve">4D AI Fluency (Dakan &amp; Feller, 2025)</w:t>
@@ -3162,7 +3162,7 @@
             </w:pPr>
             <w:r>
               <w:rPr>
-                <w:rFonts w:ascii="Georgia" w:hAnsi="Georgia"/>
+                <w:rFonts w:ascii="Times New Roman" w:hAnsi="Times New Roman"/>
                 <w:sz w:val="19"/>
               </w:rPr>
               <w:t xml:space="preserve">Delegation + part of Description</w:t>
@@ -3190,7 +3190,7 @@
             </w:pPr>
             <w:r>
               <w:rPr>
-                <w:rFonts w:ascii="Georgia" w:hAnsi="Georgia"/>
+                <w:rFonts w:ascii="Times New Roman" w:hAnsi="Times New Roman"/>
                 <w:sz w:val="19"/>
               </w:rPr>
               <w:t xml:space="preserve">Discernment</w:t>
@@ -3218,7 +3218,7 @@
             </w:pPr>
             <w:r>
               <w:rPr>
-                <w:rFonts w:ascii="Georgia" w:hAnsi="Georgia"/>
+                <w:rFonts w:ascii="Times New Roman" w:hAnsi="Times New Roman"/>
                 <w:i/>
                 <w:iCs/>
                 <w:sz w:val="19"/>
@@ -3227,14 +3227,14 @@
             </w:r>
             <w:r>
               <w:rPr>
-                <w:rFonts w:ascii="Georgia" w:hAnsi="Georgia"/>
+                <w:rFonts w:ascii="Times New Roman" w:hAnsi="Times New Roman"/>
                 <w:sz w:val="19"/>
               </w:rPr>
               <w:t xml:space="preserve"> </w:t>
             </w:r>
             <w:r>
               <w:rPr>
-                <w:rFonts w:ascii="Georgia" w:hAnsi="Georgia"/>
+                <w:rFonts w:ascii="Times New Roman" w:hAnsi="Times New Roman"/>
                 <w:sz w:val="19"/>
               </w:rPr>
               <w:t xml:space="preserve">Description</w:t>
@@ -3264,7 +3264,7 @@
             </w:pPr>
             <w:r>
               <w:rPr>
-                <w:rFonts w:ascii="Georgia" w:hAnsi="Georgia"/>
+                <w:rFonts w:ascii="Times New Roman" w:hAnsi="Times New Roman"/>
                 <w:sz w:val="19"/>
               </w:rPr>
               <w:t xml:space="preserve">Metacognitive demands (Tankelevitch et al., 2024)</w:t>
@@ -3292,7 +3292,7 @@
             </w:pPr>
             <w:r>
               <w:rPr>
-                <w:rFonts w:ascii="Georgia" w:hAnsi="Georgia"/>
+                <w:rFonts w:ascii="Times New Roman" w:hAnsi="Times New Roman"/>
                 <w:sz w:val="19"/>
               </w:rPr>
               <w:t xml:space="preserve">"prompting" (as a demand, not a skill)</w:t>
@@ -3320,7 +3320,7 @@
             </w:pPr>
             <w:r>
               <w:rPr>
-                <w:rFonts w:ascii="Georgia" w:hAnsi="Georgia"/>
+                <w:rFonts w:ascii="Times New Roman" w:hAnsi="Times New Roman"/>
                 <w:sz w:val="19"/>
               </w:rPr>
               <w:t xml:space="preserve">"evaluating outputs"</w:t>
@@ -3348,7 +3348,7 @@
             </w:pPr>
             <w:r>
               <w:rPr>
-                <w:rFonts w:ascii="Georgia" w:hAnsi="Georgia"/>
+                <w:rFonts w:ascii="Times New Roman" w:hAnsi="Times New Roman"/>
                 <w:sz w:val="19"/>
               </w:rPr>
               <w:t xml:space="preserve">"workflow iteration"</w:t>
@@ -3378,7 +3378,7 @@
             </w:pPr>
             <w:r>
               <w:rPr>
-                <w:rFonts w:ascii="Georgia" w:hAnsi="Georgia"/>
+                <w:rFonts w:ascii="Times New Roman" w:hAnsi="Times New Roman"/>
                 <w:sz w:val="19"/>
               </w:rPr>
               <w:t xml:space="preserve">Prompt literacy / CLEAR (Lo, 2023)</w:t>
@@ -3406,7 +3406,7 @@
             </w:pPr>
             <w:r>
               <w:rPr>
-                <w:rFonts w:ascii="Georgia" w:hAnsi="Georgia"/>
+                <w:rFonts w:ascii="Times New Roman" w:hAnsi="Times New Roman"/>
                 <w:i/>
                 <w:iCs/>
                 <w:sz w:val="19"/>
@@ -3415,14 +3415,14 @@
             </w:r>
             <w:r>
               <w:rPr>
-                <w:rFonts w:ascii="Georgia" w:hAnsi="Georgia"/>
+                <w:rFonts w:ascii="Times New Roman" w:hAnsi="Times New Roman"/>
                 <w:sz w:val="19"/>
               </w:rPr>
               <w:t xml:space="preserve"> </w:t>
             </w:r>
             <w:r>
               <w:rPr>
-                <w:rFonts w:ascii="Georgia" w:hAnsi="Georgia"/>
+                <w:rFonts w:ascii="Times New Roman" w:hAnsi="Times New Roman"/>
                 <w:sz w:val="19"/>
               </w:rPr>
               <w:t xml:space="preserve">"prompting"</w:t>
@@ -3450,7 +3450,7 @@
             </w:pPr>
             <w:r>
               <w:rPr>
-                <w:rFonts w:ascii="Georgia" w:hAnsi="Georgia"/>
+                <w:rFonts w:ascii="Times New Roman" w:hAnsi="Times New Roman"/>
                 <w:sz w:val="19"/>
               </w:rPr>
               <w:t xml:space="preserve">weakly present</w:t>
@@ -3478,7 +3478,7 @@
             </w:pPr>
             <w:r>
               <w:rPr>
-                <w:rFonts w:ascii="Georgia" w:hAnsi="Georgia"/>
+                <w:rFonts w:ascii="Times New Roman" w:hAnsi="Times New Roman"/>
                 <w:i/>
                 <w:iCs/>
                 <w:sz w:val="19"/>
@@ -3487,14 +3487,14 @@
             </w:r>
             <w:r>
               <w:rPr>
-                <w:rFonts w:ascii="Georgia" w:hAnsi="Georgia"/>
+                <w:rFonts w:ascii="Times New Roman" w:hAnsi="Times New Roman"/>
                 <w:sz w:val="19"/>
               </w:rPr>
               <w:t xml:space="preserve"> </w:t>
             </w:r>
             <w:r>
               <w:rPr>
-                <w:rFonts w:ascii="Georgia" w:hAnsi="Georgia"/>
+                <w:rFonts w:ascii="Times New Roman" w:hAnsi="Times New Roman"/>
                 <w:sz w:val="19"/>
               </w:rPr>
               <w:t xml:space="preserve">"iterative refinement"</w:t>
@@ -3524,7 +3524,7 @@
             </w:pPr>
             <w:r>
               <w:rPr>
-                <w:rFonts w:ascii="Georgia" w:hAnsi="Georgia"/>
+                <w:rFonts w:ascii="Times New Roman" w:hAnsi="Times New Roman"/>
                 <w:sz w:val="19"/>
               </w:rPr>
               <w:t xml:space="preserve">AI literacy (Long &amp; Magerko, 2020; UNESCO, 2024)</w:t>
@@ -3552,7 +3552,7 @@
             </w:pPr>
             <w:r>
               <w:rPr>
-                <w:rFonts w:ascii="Georgia" w:hAnsi="Georgia"/>
+                <w:rFonts w:ascii="Times New Roman" w:hAnsi="Times New Roman"/>
                 <w:sz w:val="19"/>
               </w:rPr>
               <w:t xml:space="preserve">absent</w:t>
@@ -3580,7 +3580,7 @@
             </w:pPr>
             <w:r>
               <w:rPr>
-                <w:rFonts w:ascii="Georgia" w:hAnsi="Georgia"/>
+                <w:rFonts w:ascii="Times New Roman" w:hAnsi="Times New Roman"/>
                 <w:sz w:val="19"/>
               </w:rPr>
               <w:t xml:space="preserve">diffuse "critical evaluation"</w:t>
@@ -3608,7 +3608,7 @@
             </w:pPr>
             <w:r>
               <w:rPr>
-                <w:rFonts w:ascii="Georgia" w:hAnsi="Georgia"/>
+                <w:rFonts w:ascii="Times New Roman" w:hAnsi="Times New Roman"/>
                 <w:sz w:val="19"/>
               </w:rPr>
               <w:t xml:space="preserve">absent</w:t>
@@ -3638,7 +3638,7 @@
             </w:pPr>
             <w:r>
               <w:rPr>
-                <w:rFonts w:ascii="Georgia" w:hAnsi="Georgia"/>
+                <w:rFonts w:ascii="Times New Roman" w:hAnsi="Times New Roman"/>
                 <w:sz w:val="19"/>
               </w:rPr>
               <w:t xml:space="preserve">Cyborg/Centaur modes (Randazzo et al., 2025)</w:t>
@@ -3666,7 +3666,7 @@
             </w:pPr>
             <w:r>
               <w:rPr>
-                <w:rFonts w:ascii="Georgia" w:hAnsi="Georgia"/>
+                <w:rFonts w:ascii="Times New Roman" w:hAnsi="Times New Roman"/>
                 <w:sz w:val="19"/>
               </w:rPr>
               <w:t xml:space="preserve">"directed" mode (described, not assessed)</w:t>
@@ -3694,7 +3694,7 @@
             </w:pPr>
             <w:r>
               <w:rPr>
-                <w:rFonts w:ascii="Georgia" w:hAnsi="Georgia"/>
+                <w:rFonts w:ascii="Times New Roman" w:hAnsi="Times New Roman"/>
                 <w:sz w:val="19"/>
               </w:rPr>
               <w:t xml:space="preserve">"push back / validate"</w:t>
@@ -3722,7 +3722,7 @@
             </w:pPr>
             <w:r>
               <w:rPr>
-                <w:rFonts w:ascii="Georgia" w:hAnsi="Georgia"/>
+                <w:rFonts w:ascii="Times New Roman" w:hAnsi="Times New Roman"/>
                 <w:sz w:val="19"/>
               </w:rPr>
               <w:t xml:space="preserve">"continuous dialogue"</w:t>
@@ -5194,7 +5194,7 @@
             </w:pPr>
             <w:r>
               <w:rPr>
-                <w:rFonts w:ascii="Georgia" w:hAnsi="Georgia"/>
+                <w:rFonts w:ascii="Times New Roman" w:hAnsi="Times New Roman"/>
                 <w:b/>
                 <w:sz w:val="19"/>
               </w:rPr>
@@ -5223,7 +5223,7 @@
             </w:pPr>
             <w:r>
               <w:rPr>
-                <w:rFonts w:ascii="Georgia" w:hAnsi="Georgia"/>
+                <w:rFonts w:ascii="Times New Roman" w:hAnsi="Times New Roman"/>
                 <w:b/>
                 <w:sz w:val="19"/>
               </w:rPr>
@@ -5252,7 +5252,7 @@
             </w:pPr>
             <w:r>
               <w:rPr>
-                <w:rFonts w:ascii="Georgia" w:hAnsi="Georgia"/>
+                <w:rFonts w:ascii="Times New Roman" w:hAnsi="Times New Roman"/>
                 <w:b/>
                 <w:sz w:val="19"/>
               </w:rPr>
@@ -5281,7 +5281,7 @@
             </w:pPr>
             <w:r>
               <w:rPr>
-                <w:rFonts w:ascii="Georgia" w:hAnsi="Georgia"/>
+                <w:rFonts w:ascii="Times New Roman" w:hAnsi="Times New Roman"/>
                 <w:b/>
                 <w:sz w:val="19"/>
               </w:rPr>
@@ -5312,7 +5312,7 @@
             </w:pPr>
             <w:r>
               <w:rPr>
-                <w:rFonts w:ascii="Georgia" w:hAnsi="Georgia"/>
+                <w:rFonts w:ascii="Times New Roman" w:hAnsi="Times New Roman"/>
                 <w:b/>
                 <w:bCs/>
                 <w:sz w:val="19"/>
@@ -5342,7 +5342,7 @@
             </w:pPr>
             <w:r>
               <w:rPr>
-                <w:rFonts w:ascii="Georgia" w:hAnsi="Georgia"/>
+                <w:rFonts w:ascii="Times New Roman" w:hAnsi="Times New Roman"/>
                 <w:b/>
                 <w:bCs/>
                 <w:sz w:val="19"/>
@@ -5372,7 +5372,7 @@
             </w:pPr>
             <w:r>
               <w:rPr>
-                <w:rFonts w:ascii="Georgia" w:hAnsi="Georgia"/>
+                <w:rFonts w:ascii="Times New Roman" w:hAnsi="Times New Roman"/>
                 <w:sz w:val="19"/>
               </w:rPr>
               <w:t xml:space="preserve">−0.02</w:t>
@@ -5400,7 +5400,7 @@
             </w:pPr>
             <w:r>
               <w:rPr>
-                <w:rFonts w:ascii="Georgia" w:hAnsi="Georgia"/>
+                <w:rFonts w:ascii="Times New Roman" w:hAnsi="Times New Roman"/>
                 <w:sz w:val="19"/>
               </w:rPr>
               <w:t xml:space="preserve">−0.07</w:t>
@@ -5430,7 +5430,7 @@
             </w:pPr>
             <w:r>
               <w:rPr>
-                <w:rFonts w:ascii="Georgia" w:hAnsi="Georgia"/>
+                <w:rFonts w:ascii="Times New Roman" w:hAnsi="Times New Roman"/>
                 <w:b/>
                 <w:bCs/>
                 <w:sz w:val="19"/>
@@ -5460,7 +5460,7 @@
             </w:pPr>
             <w:r>
               <w:rPr>
-                <w:rFonts w:ascii="Georgia" w:hAnsi="Georgia"/>
+                <w:rFonts w:ascii="Times New Roman" w:hAnsi="Times New Roman"/>
                 <w:sz w:val="19"/>
               </w:rPr>
               <w:t xml:space="preserve">+0.00</w:t>
@@ -5488,7 +5488,7 @@
             </w:pPr>
             <w:r>
               <w:rPr>
-                <w:rFonts w:ascii="Georgia" w:hAnsi="Georgia"/>
+                <w:rFonts w:ascii="Times New Roman" w:hAnsi="Times New Roman"/>
                 <w:b/>
                 <w:bCs/>
                 <w:sz w:val="19"/>
@@ -5518,7 +5518,7 @@
             </w:pPr>
             <w:r>
               <w:rPr>
-                <w:rFonts w:ascii="Georgia" w:hAnsi="Georgia"/>
+                <w:rFonts w:ascii="Times New Roman" w:hAnsi="Times New Roman"/>
                 <w:sz w:val="19"/>
               </w:rPr>
               <w:t xml:space="preserve">+0.00</w:t>
@@ -5548,7 +5548,7 @@
             </w:pPr>
             <w:r>
               <w:rPr>
-                <w:rFonts w:ascii="Georgia" w:hAnsi="Georgia"/>
+                <w:rFonts w:ascii="Times New Roman" w:hAnsi="Times New Roman"/>
                 <w:b/>
                 <w:bCs/>
                 <w:sz w:val="19"/>
@@ -5578,7 +5578,7 @@
             </w:pPr>
             <w:r>
               <w:rPr>
-                <w:rFonts w:ascii="Georgia" w:hAnsi="Georgia"/>
+                <w:rFonts w:ascii="Times New Roman" w:hAnsi="Times New Roman"/>
                 <w:sz w:val="19"/>
               </w:rPr>
               <w:t xml:space="preserve">−0.12</w:t>
@@ -5606,7 +5606,7 @@
             </w:pPr>
             <w:r>
               <w:rPr>
-                <w:rFonts w:ascii="Georgia" w:hAnsi="Georgia"/>
+                <w:rFonts w:ascii="Times New Roman" w:hAnsi="Times New Roman"/>
                 <w:sz w:val="19"/>
               </w:rPr>
               <w:t xml:space="preserve">+0.27</w:t>
@@ -5634,7 +5634,7 @@
             </w:pPr>
             <w:r>
               <w:rPr>
-                <w:rFonts w:ascii="Georgia" w:hAnsi="Georgia"/>
+                <w:rFonts w:ascii="Times New Roman" w:hAnsi="Times New Roman"/>
                 <w:b/>
                 <w:bCs/>
                 <w:sz w:val="19"/>
@@ -6292,7 +6292,7 @@
             </w:pPr>
             <w:r>
               <w:rPr>
-                <w:rFonts w:ascii="Georgia" w:hAnsi="Georgia"/>
+                <w:rFonts w:ascii="Times New Roman" w:hAnsi="Times New Roman"/>
                 <w:b/>
                 <w:sz w:val="19"/>
               </w:rPr>
@@ -6305,7 +6305,7 @@
             </m:oMath>
             <w:r>
               <w:rPr>
-                <w:rFonts w:ascii="Georgia" w:hAnsi="Georgia"/>
+                <w:rFonts w:ascii="Times New Roman" w:hAnsi="Times New Roman"/>
                 <w:b/>
                 <w:sz w:val="19"/>
               </w:rPr>
@@ -6334,7 +6334,7 @@
             </w:pPr>
             <w:r>
               <w:rPr>
-                <w:rFonts w:ascii="Georgia" w:hAnsi="Georgia"/>
+                <w:rFonts w:ascii="Times New Roman" w:hAnsi="Times New Roman"/>
                 <w:b/>
                 <w:sz w:val="19"/>
               </w:rPr>
@@ -6363,7 +6363,7 @@
             </w:pPr>
             <w:r>
               <w:rPr>
-                <w:rFonts w:ascii="Georgia" w:hAnsi="Georgia"/>
+                <w:rFonts w:ascii="Times New Roman" w:hAnsi="Times New Roman"/>
                 <w:b/>
                 <w:sz w:val="19"/>
               </w:rPr>
@@ -6392,7 +6392,7 @@
             </w:pPr>
             <w:r>
               <w:rPr>
-                <w:rFonts w:ascii="Georgia" w:hAnsi="Georgia"/>
+                <w:rFonts w:ascii="Times New Roman" w:hAnsi="Times New Roman"/>
                 <w:b/>
                 <w:sz w:val="19"/>
               </w:rPr>
@@ -6423,7 +6423,7 @@
             </w:pPr>
             <w:r>
               <w:rPr>
-                <w:rFonts w:ascii="Georgia" w:hAnsi="Georgia"/>
+                <w:rFonts w:ascii="Times New Roman" w:hAnsi="Times New Roman"/>
                 <w:sz w:val="19"/>
               </w:rPr>
               <w:t xml:space="preserve">same skill across gpt-4o, gpt-4o-mini, llama-3.3-70b</w:t>
@@ -6451,7 +6451,7 @@
             </w:pPr>
             <w:r>
               <w:rPr>
-                <w:rFonts w:ascii="Georgia" w:hAnsi="Georgia"/>
+                <w:rFonts w:ascii="Times New Roman" w:hAnsi="Times New Roman"/>
                 <w:b/>
                 <w:bCs/>
                 <w:sz w:val="19"/>
@@ -6481,7 +6481,7 @@
             </w:pPr>
             <w:r>
               <w:rPr>
-                <w:rFonts w:ascii="Georgia" w:hAnsi="Georgia"/>
+                <w:rFonts w:ascii="Times New Roman" w:hAnsi="Times New Roman"/>
                 <w:b/>
                 <w:bCs/>
                 <w:sz w:val="19"/>
@@ -6511,7 +6511,7 @@
             </w:pPr>
             <w:r>
               <w:rPr>
-                <w:rFonts w:ascii="Georgia" w:hAnsi="Georgia"/>
+                <w:rFonts w:ascii="Times New Roman" w:hAnsi="Times New Roman"/>
                 <w:sz w:val="19"/>
               </w:rPr>
               <w:t xml:space="preserve">+0.21</w:t>
@@ -6569,7 +6569,7 @@
             </w:pPr>
             <w:r>
               <w:rPr>
-                <w:rFonts w:ascii="Georgia" w:hAnsi="Georgia"/>
+                <w:rFonts w:ascii="Times New Roman" w:hAnsi="Times New Roman"/>
                 <w:b/>
                 <w:sz w:val="19"/>
               </w:rPr>
@@ -6577,7 +6577,7 @@
             </w:r>
             <w:r>
               <w:rPr>
-                <w:rFonts w:ascii="Georgia" w:hAnsi="Georgia"/>
+                <w:rFonts w:ascii="Times New Roman" w:hAnsi="Times New Roman"/>
                 <w:b/>
                 <w:sz w:val="19"/>
               </w:rPr>
@@ -6590,7 +6590,7 @@
             </m:oMath>
             <w:r>
               <w:rPr>
-                <w:rFonts w:ascii="Georgia" w:hAnsi="Georgia"/>
+                <w:rFonts w:ascii="Times New Roman" w:hAnsi="Times New Roman"/>
                 <w:b/>
                 <w:sz w:val="19"/>
               </w:rPr>
@@ -6598,7 +6598,7 @@
             </w:r>
             <w:r>
               <w:rPr>
-                <w:rFonts w:ascii="Georgia" w:hAnsi="Georgia"/>
+                <w:rFonts w:ascii="Times New Roman" w:hAnsi="Times New Roman"/>
                 <w:b/>
                 <w:sz w:val="19"/>
               </w:rPr>
@@ -6627,7 +6627,7 @@
             </w:pPr>
             <w:r>
               <w:rPr>
-                <w:rFonts w:ascii="Georgia" w:hAnsi="Georgia"/>
+                <w:rFonts w:ascii="Times New Roman" w:hAnsi="Times New Roman"/>
                 <w:b/>
                 <w:sz w:val="19"/>
               </w:rPr>
@@ -6656,7 +6656,7 @@
             </w:pPr>
             <w:r>
               <w:rPr>
-                <w:rFonts w:ascii="Georgia" w:hAnsi="Georgia"/>
+                <w:rFonts w:ascii="Times New Roman" w:hAnsi="Times New Roman"/>
                 <w:b/>
                 <w:sz w:val="19"/>
               </w:rPr>
@@ -6685,7 +6685,7 @@
             </w:pPr>
             <w:r>
               <w:rPr>
-                <w:rFonts w:ascii="Georgia" w:hAnsi="Georgia"/>
+                <w:rFonts w:ascii="Times New Roman" w:hAnsi="Times New Roman"/>
                 <w:b/>
                 <w:sz w:val="19"/>
               </w:rPr>
@@ -6714,7 +6714,7 @@
             </w:pPr>
             <w:r>
               <w:rPr>
-                <w:rFonts w:ascii="Georgia" w:hAnsi="Georgia"/>
+                <w:rFonts w:ascii="Times New Roman" w:hAnsi="Times New Roman"/>
                 <w:b/>
                 <w:sz w:val="19"/>
               </w:rPr>
@@ -6745,7 +6745,7 @@
             </w:pPr>
             <w:r>
               <w:rPr>
-                <w:rFonts w:ascii="Georgia" w:hAnsi="Georgia"/>
+                <w:rFonts w:ascii="Times New Roman" w:hAnsi="Times New Roman"/>
                 <w:sz w:val="19"/>
               </w:rPr>
               <w:t xml:space="preserve">independent (crossed) competences</w:t>
@@ -6773,7 +6773,7 @@
             </w:pPr>
             <w:r>
               <w:rPr>
-                <w:rFonts w:ascii="Georgia" w:hAnsi="Georgia"/>
+                <w:rFonts w:ascii="Times New Roman" w:hAnsi="Times New Roman"/>
                 <w:sz w:val="19"/>
               </w:rPr>
               <w:t xml:space="preserve">−0.03</w:t>
@@ -6801,7 +6801,7 @@
             </w:pPr>
             <w:r>
               <w:rPr>
-                <w:rFonts w:ascii="Georgia" w:hAnsi="Georgia"/>
+                <w:rFonts w:ascii="Times New Roman" w:hAnsi="Times New Roman"/>
                 <w:sz w:val="19"/>
               </w:rPr>
               <w:t xml:space="preserve">−0.12</w:t>
@@ -6829,7 +6829,7 @@
             </w:pPr>
             <w:r>
               <w:rPr>
-                <w:rFonts w:ascii="Georgia" w:hAnsi="Georgia"/>
+                <w:rFonts w:ascii="Times New Roman" w:hAnsi="Times New Roman"/>
                 <w:sz w:val="19"/>
               </w:rPr>
               <w:t xml:space="preserve">+0.25</w:t>
@@ -6857,14 +6857,14 @@
             </w:pPr>
             <w:r>
               <w:rPr>
-                <w:rFonts w:ascii="Georgia" w:hAnsi="Georgia"/>
+                <w:rFonts w:ascii="Times New Roman" w:hAnsi="Times New Roman"/>
                 <w:sz w:val="19"/>
               </w:rPr>
               <w:t xml:space="preserve">mean</w:t>
             </w:r>
             <w:r>
               <w:rPr>
-                <w:rFonts w:ascii="Georgia" w:hAnsi="Georgia"/>
+                <w:rFonts w:ascii="Times New Roman" w:hAnsi="Times New Roman"/>
                 <w:sz w:val="19"/>
               </w:rPr>
               <w:t xml:space="preserve"> </w:t>
@@ -6888,14 +6888,14 @@
             </m:oMath>
             <w:r>
               <w:rPr>
-                <w:rFonts w:ascii="Georgia" w:hAnsi="Georgia"/>
+                <w:rFonts w:ascii="Times New Roman" w:hAnsi="Times New Roman"/>
                 <w:sz w:val="19"/>
               </w:rPr>
               <w:t xml:space="preserve"> </w:t>
             </w:r>
             <w:r>
               <w:rPr>
-                <w:rFonts w:ascii="Georgia" w:hAnsi="Georgia"/>
+                <w:rFonts w:ascii="Times New Roman" w:hAnsi="Times New Roman"/>
                 <w:sz w:val="19"/>
               </w:rPr>
               <w:t xml:space="preserve">= 0.13</w:t>
@@ -6925,7 +6925,7 @@
             </w:pPr>
             <w:r>
               <w:rPr>
-                <w:rFonts w:ascii="Georgia" w:hAnsi="Georgia"/>
+                <w:rFonts w:ascii="Times New Roman" w:hAnsi="Times New Roman"/>
                 <w:sz w:val="19"/>
               </w:rPr>
               <w:t xml:space="preserve">shared single-ability level</w:t>
@@ -6953,7 +6953,7 @@
             </w:pPr>
             <w:r>
               <w:rPr>
-                <w:rFonts w:ascii="Georgia" w:hAnsi="Georgia"/>
+                <w:rFonts w:ascii="Times New Roman" w:hAnsi="Times New Roman"/>
                 <w:b/>
                 <w:bCs/>
                 <w:sz w:val="19"/>
@@ -6983,7 +6983,7 @@
             </w:pPr>
             <w:r>
               <w:rPr>
-                <w:rFonts w:ascii="Georgia" w:hAnsi="Georgia"/>
+                <w:rFonts w:ascii="Times New Roman" w:hAnsi="Times New Roman"/>
                 <w:sz w:val="19"/>
               </w:rPr>
               <w:t xml:space="preserve">+0.14</w:t>
@@ -7011,7 +7011,7 @@
             </w:pPr>
             <w:r>
               <w:rPr>
-                <w:rFonts w:ascii="Georgia" w:hAnsi="Georgia"/>
+                <w:rFonts w:ascii="Times New Roman" w:hAnsi="Times New Roman"/>
                 <w:b/>
                 <w:bCs/>
                 <w:sz w:val="19"/>
@@ -7041,14 +7041,14 @@
             </w:pPr>
             <w:r>
               <w:rPr>
-                <w:rFonts w:ascii="Georgia" w:hAnsi="Georgia"/>
+                <w:rFonts w:ascii="Times New Roman" w:hAnsi="Times New Roman"/>
                 <w:sz w:val="19"/>
               </w:rPr>
               <w:t xml:space="preserve">mean</w:t>
             </w:r>
             <w:r>
               <w:rPr>
-                <w:rFonts w:ascii="Georgia" w:hAnsi="Georgia"/>
+                <w:rFonts w:ascii="Times New Roman" w:hAnsi="Times New Roman"/>
                 <w:sz w:val="19"/>
               </w:rPr>
               <w:t xml:space="preserve"> </w:t>
@@ -7060,14 +7060,14 @@
             </m:oMath>
             <w:r>
               <w:rPr>
-                <w:rFonts w:ascii="Georgia" w:hAnsi="Georgia"/>
+                <w:rFonts w:ascii="Times New Roman" w:hAnsi="Times New Roman"/>
                 <w:sz w:val="19"/>
               </w:rPr>
               <w:t xml:space="preserve"> </w:t>
             </w:r>
             <w:r>
               <w:rPr>
-                <w:rFonts w:ascii="Georgia" w:hAnsi="Georgia"/>
+                <w:rFonts w:ascii="Times New Roman" w:hAnsi="Times New Roman"/>
                 <w:sz w:val="19"/>
               </w:rPr>
               <w:t xml:space="preserve">= +0.41</w:t>
@@ -8666,7 +8666,7 @@
       </w:pPr>
       <w:r>
         <w:rPr>
-          <w:rFonts w:ascii="Georgia" w:hAnsi="Georgia"/>
+          <w:rFonts w:ascii="Times New Roman" w:hAnsi="Times New Roman"/>
           <w:sz w:val="20"/>
         </w:rPr>
         <w:t xml:space="preserve">1. </w:t>
@@ -8700,7 +8700,7 @@
       </w:pPr>
       <w:r>
         <w:rPr>
-          <w:rFonts w:ascii="Georgia" w:hAnsi="Georgia"/>
+          <w:rFonts w:ascii="Times New Roman" w:hAnsi="Times New Roman"/>
           <w:sz w:val="20"/>
         </w:rPr>
         <w:t xml:space="preserve">2. </w:t>
@@ -8721,7 +8721,7 @@
       </w:pPr>
       <w:r>
         <w:rPr>
-          <w:rFonts w:ascii="Georgia" w:hAnsi="Georgia"/>
+          <w:rFonts w:ascii="Times New Roman" w:hAnsi="Times New Roman"/>
           <w:sz w:val="20"/>
         </w:rPr>
         <w:t xml:space="preserve">3. </w:t>
@@ -8755,7 +8755,7 @@
       </w:pPr>
       <w:r>
         <w:rPr>
-          <w:rFonts w:ascii="Georgia" w:hAnsi="Georgia"/>
+          <w:rFonts w:ascii="Times New Roman" w:hAnsi="Times New Roman"/>
           <w:sz w:val="20"/>
         </w:rPr>
         <w:t xml:space="preserve">4. </w:t>
@@ -8789,7 +8789,7 @@
       </w:pPr>
       <w:r>
         <w:rPr>
-          <w:rFonts w:ascii="Georgia" w:hAnsi="Georgia"/>
+          <w:rFonts w:ascii="Times New Roman" w:hAnsi="Times New Roman"/>
           <w:sz w:val="20"/>
         </w:rPr>
         <w:t xml:space="preserve">5. </w:t>
@@ -8823,7 +8823,7 @@
       </w:pPr>
       <w:r>
         <w:rPr>
-          <w:rFonts w:ascii="Georgia" w:hAnsi="Georgia"/>
+          <w:rFonts w:ascii="Times New Roman" w:hAnsi="Times New Roman"/>
           <w:sz w:val="20"/>
         </w:rPr>
         <w:t xml:space="preserve">6. </w:t>
@@ -8857,7 +8857,7 @@
       </w:pPr>
       <w:r>
         <w:rPr>
-          <w:rFonts w:ascii="Georgia" w:hAnsi="Georgia"/>
+          <w:rFonts w:ascii="Times New Roman" w:hAnsi="Times New Roman"/>
           <w:sz w:val="20"/>
         </w:rPr>
         <w:t xml:space="preserve">7. </w:t>
@@ -8891,7 +8891,7 @@
       </w:pPr>
       <w:r>
         <w:rPr>
-          <w:rFonts w:ascii="Georgia" w:hAnsi="Georgia"/>
+          <w:rFonts w:ascii="Times New Roman" w:hAnsi="Times New Roman"/>
           <w:sz w:val="20"/>
         </w:rPr>
         <w:t xml:space="preserve">8. </w:t>
@@ -8925,7 +8925,7 @@
       </w:pPr>
       <w:r>
         <w:rPr>
-          <w:rFonts w:ascii="Georgia" w:hAnsi="Georgia"/>
+          <w:rFonts w:ascii="Times New Roman" w:hAnsi="Times New Roman"/>
           <w:sz w:val="20"/>
         </w:rPr>
         <w:t xml:space="preserve">9. </w:t>
@@ -8959,7 +8959,7 @@
       </w:pPr>
       <w:r>
         <w:rPr>
-          <w:rFonts w:ascii="Georgia" w:hAnsi="Georgia"/>
+          <w:rFonts w:ascii="Times New Roman" w:hAnsi="Times New Roman"/>
           <w:sz w:val="20"/>
         </w:rPr>
         <w:t xml:space="preserve">10. </w:t>
@@ -8993,7 +8993,7 @@
       </w:pPr>
       <w:r>
         <w:rPr>
-          <w:rFonts w:ascii="Georgia" w:hAnsi="Georgia"/>
+          <w:rFonts w:ascii="Times New Roman" w:hAnsi="Times New Roman"/>
           <w:sz w:val="20"/>
         </w:rPr>
         <w:t xml:space="preserve">11. </w:t>
@@ -9027,7 +9027,7 @@
       </w:pPr>
       <w:r>
         <w:rPr>
-          <w:rFonts w:ascii="Georgia" w:hAnsi="Georgia"/>
+          <w:rFonts w:ascii="Times New Roman" w:hAnsi="Times New Roman"/>
           <w:sz w:val="20"/>
         </w:rPr>
         <w:t xml:space="preserve">12. </w:t>
@@ -9061,7 +9061,7 @@
       </w:pPr>
       <w:r>
         <w:rPr>
-          <w:rFonts w:ascii="Georgia" w:hAnsi="Georgia"/>
+          <w:rFonts w:ascii="Times New Roman" w:hAnsi="Times New Roman"/>
           <w:sz w:val="20"/>
         </w:rPr>
         <w:t xml:space="preserve">13. </w:t>
@@ -9082,7 +9082,7 @@
       </w:pPr>
       <w:r>
         <w:rPr>
-          <w:rFonts w:ascii="Georgia" w:hAnsi="Georgia"/>
+          <w:rFonts w:ascii="Times New Roman" w:hAnsi="Times New Roman"/>
           <w:sz w:val="20"/>
         </w:rPr>
         <w:t xml:space="preserve">14. </w:t>
@@ -9116,7 +9116,7 @@
       </w:pPr>
       <w:r>
         <w:rPr>
-          <w:rFonts w:ascii="Georgia" w:hAnsi="Georgia"/>
+          <w:rFonts w:ascii="Times New Roman" w:hAnsi="Times New Roman"/>
           <w:sz w:val="20"/>
         </w:rPr>
         <w:t xml:space="preserve">15. </w:t>
@@ -9150,7 +9150,7 @@
       </w:pPr>
       <w:r>
         <w:rPr>
-          <w:rFonts w:ascii="Georgia" w:hAnsi="Georgia"/>
+          <w:rFonts w:ascii="Times New Roman" w:hAnsi="Times New Roman"/>
           <w:sz w:val="20"/>
         </w:rPr>
         <w:t xml:space="preserve">16. </w:t>
@@ -9184,7 +9184,7 @@
       </w:pPr>
       <w:r>
         <w:rPr>
-          <w:rFonts w:ascii="Georgia" w:hAnsi="Georgia"/>
+          <w:rFonts w:ascii="Times New Roman" w:hAnsi="Times New Roman"/>
           <w:sz w:val="20"/>
         </w:rPr>
         <w:t xml:space="preserve">17. </w:t>
@@ -9218,7 +9218,7 @@
       </w:pPr>
       <w:r>
         <w:rPr>
-          <w:rFonts w:ascii="Georgia" w:hAnsi="Georgia"/>
+          <w:rFonts w:ascii="Times New Roman" w:hAnsi="Times New Roman"/>
           <w:sz w:val="20"/>
         </w:rPr>
         <w:t xml:space="preserve">18. </w:t>
@@ -9252,7 +9252,7 @@
       </w:pPr>
       <w:r>
         <w:rPr>
-          <w:rFonts w:ascii="Georgia" w:hAnsi="Georgia"/>
+          <w:rFonts w:ascii="Times New Roman" w:hAnsi="Times New Roman"/>
           <w:sz w:val="20"/>
         </w:rPr>
         <w:t xml:space="preserve">19. </w:t>
@@ -9273,7 +9273,7 @@
       </w:pPr>
       <w:r>
         <w:rPr>
-          <w:rFonts w:ascii="Georgia" w:hAnsi="Georgia"/>
+          <w:rFonts w:ascii="Times New Roman" w:hAnsi="Times New Roman"/>
           <w:sz w:val="20"/>
         </w:rPr>
         <w:t xml:space="preserve">20. </w:t>
@@ -9307,7 +9307,7 @@
       </w:pPr>
       <w:r>
         <w:rPr>
-          <w:rFonts w:ascii="Georgia" w:hAnsi="Georgia"/>
+          <w:rFonts w:ascii="Times New Roman" w:hAnsi="Times New Roman"/>
           <w:sz w:val="20"/>
         </w:rPr>
         <w:t xml:space="preserve">21. </w:t>
@@ -9341,7 +9341,7 @@
       </w:pPr>
       <w:r>
         <w:rPr>
-          <w:rFonts w:ascii="Georgia" w:hAnsi="Georgia"/>
+          <w:rFonts w:ascii="Times New Roman" w:hAnsi="Times New Roman"/>
           <w:sz w:val="20"/>
         </w:rPr>
         <w:t xml:space="preserve">22. </w:t>
@@ -9375,7 +9375,7 @@
       </w:pPr>
       <w:r>
         <w:rPr>
-          <w:rFonts w:ascii="Georgia" w:hAnsi="Georgia"/>
+          <w:rFonts w:ascii="Times New Roman" w:hAnsi="Times New Roman"/>
           <w:sz w:val="20"/>
         </w:rPr>
         <w:t xml:space="preserve">23. </w:t>
@@ -9409,7 +9409,7 @@
       </w:pPr>
       <w:r>
         <w:rPr>
-          <w:rFonts w:ascii="Georgia" w:hAnsi="Georgia"/>
+          <w:rFonts w:ascii="Times New Roman" w:hAnsi="Times New Roman"/>
           <w:sz w:val="20"/>
         </w:rPr>
         <w:t xml:space="preserve">24. </w:t>
@@ -9443,7 +9443,7 @@
       </w:pPr>
       <w:r>
         <w:rPr>
-          <w:rFonts w:ascii="Georgia" w:hAnsi="Georgia"/>
+          <w:rFonts w:ascii="Times New Roman" w:hAnsi="Times New Roman"/>
           <w:sz w:val="20"/>
         </w:rPr>
         <w:t xml:space="preserve">25. </w:t>
@@ -9477,7 +9477,7 @@
       </w:pPr>
       <w:r>
         <w:rPr>
-          <w:rFonts w:ascii="Georgia" w:hAnsi="Georgia"/>
+          <w:rFonts w:ascii="Times New Roman" w:hAnsi="Times New Roman"/>
           <w:sz w:val="20"/>
         </w:rPr>
         <w:t xml:space="preserve">26. </w:t>
@@ -9511,7 +9511,7 @@
       </w:pPr>
       <w:r>
         <w:rPr>
-          <w:rFonts w:ascii="Georgia" w:hAnsi="Georgia"/>
+          <w:rFonts w:ascii="Times New Roman" w:hAnsi="Times New Roman"/>
           <w:sz w:val="20"/>
         </w:rPr>
         <w:t xml:space="preserve">27. </w:t>
@@ -9545,7 +9545,7 @@
       </w:pPr>
       <w:r>
         <w:rPr>
-          <w:rFonts w:ascii="Georgia" w:hAnsi="Georgia"/>
+          <w:rFonts w:ascii="Times New Roman" w:hAnsi="Times New Roman"/>
           <w:sz w:val="20"/>
         </w:rPr>
         <w:t xml:space="preserve">28. </w:t>
@@ -9579,7 +9579,7 @@
       </w:pPr>
       <w:r>
         <w:rPr>
-          <w:rFonts w:ascii="Georgia" w:hAnsi="Georgia"/>
+          <w:rFonts w:ascii="Times New Roman" w:hAnsi="Times New Roman"/>
           <w:sz w:val="20"/>
         </w:rPr>
         <w:t xml:space="preserve">29. </w:t>
@@ -9613,7 +9613,7 @@
       </w:pPr>
       <w:r>
         <w:rPr>
-          <w:rFonts w:ascii="Georgia" w:hAnsi="Georgia"/>
+          <w:rFonts w:ascii="Times New Roman" w:hAnsi="Times New Roman"/>
           <w:sz w:val="20"/>
         </w:rPr>
         <w:t xml:space="preserve">30. </w:t>
@@ -9647,7 +9647,7 @@
       </w:pPr>
       <w:r>
         <w:rPr>
-          <w:rFonts w:ascii="Georgia" w:hAnsi="Georgia"/>
+          <w:rFonts w:ascii="Times New Roman" w:hAnsi="Times New Roman"/>
           <w:sz w:val="20"/>
         </w:rPr>
         <w:t xml:space="preserve">31. </w:t>
@@ -9681,7 +9681,7 @@
       </w:pPr>
       <w:r>
         <w:rPr>
-          <w:rFonts w:ascii="Georgia" w:hAnsi="Georgia"/>
+          <w:rFonts w:ascii="Times New Roman" w:hAnsi="Times New Roman"/>
           <w:sz w:val="20"/>
         </w:rPr>
         <w:t xml:space="preserve">32. </w:t>
@@ -9715,7 +9715,7 @@
       </w:pPr>
       <w:r>
         <w:rPr>
-          <w:rFonts w:ascii="Georgia" w:hAnsi="Georgia"/>
+          <w:rFonts w:ascii="Times New Roman" w:hAnsi="Times New Roman"/>
           <w:sz w:val="20"/>
         </w:rPr>
         <w:t xml:space="preserve">33. </w:t>
@@ -9749,7 +9749,7 @@
       </w:pPr>
       <w:r>
         <w:rPr>
-          <w:rFonts w:ascii="Georgia" w:hAnsi="Georgia"/>
+          <w:rFonts w:ascii="Times New Roman" w:hAnsi="Times New Roman"/>
           <w:sz w:val="20"/>
         </w:rPr>
         <w:t xml:space="preserve">34. </w:t>
@@ -9783,7 +9783,7 @@
       </w:pPr>
       <w:r>
         <w:rPr>
-          <w:rFonts w:ascii="Georgia" w:hAnsi="Georgia"/>
+          <w:rFonts w:ascii="Times New Roman" w:hAnsi="Times New Roman"/>
           <w:sz w:val="20"/>
         </w:rPr>
         <w:t xml:space="preserve">35. </w:t>
@@ -9817,7 +9817,7 @@
       </w:pPr>
       <w:r>
         <w:rPr>
-          <w:rFonts w:ascii="Georgia" w:hAnsi="Georgia"/>
+          <w:rFonts w:ascii="Times New Roman" w:hAnsi="Times New Roman"/>
           <w:sz w:val="20"/>
         </w:rPr>
         <w:t xml:space="preserve">36. </w:t>
@@ -9851,7 +9851,7 @@
       </w:pPr>
       <w:r>
         <w:rPr>
-          <w:rFonts w:ascii="Georgia" w:hAnsi="Georgia"/>
+          <w:rFonts w:ascii="Times New Roman" w:hAnsi="Times New Roman"/>
           <w:sz w:val="20"/>
         </w:rPr>
         <w:t xml:space="preserve">37. </w:t>
@@ -9885,7 +9885,7 @@
       </w:pPr>
       <w:r>
         <w:rPr>
-          <w:rFonts w:ascii="Georgia" w:hAnsi="Georgia"/>
+          <w:rFonts w:ascii="Times New Roman" w:hAnsi="Times New Roman"/>
           <w:sz w:val="20"/>
         </w:rPr>
         <w:t xml:space="preserve">38. </w:t>
@@ -9919,7 +9919,7 @@
       </w:pPr>
       <w:r>
         <w:rPr>
-          <w:rFonts w:ascii="Georgia" w:hAnsi="Georgia"/>
+          <w:rFonts w:ascii="Times New Roman" w:hAnsi="Times New Roman"/>
           <w:sz w:val="20"/>
         </w:rPr>
         <w:t xml:space="preserve">39. </w:t>
@@ -9953,7 +9953,7 @@
       </w:pPr>
       <w:r>
         <w:rPr>
-          <w:rFonts w:ascii="Georgia" w:hAnsi="Georgia"/>
+          <w:rFonts w:ascii="Times New Roman" w:hAnsi="Times New Roman"/>
           <w:sz w:val="20"/>
         </w:rPr>
         <w:t xml:space="preserve">40. </w:t>
@@ -9987,7 +9987,7 @@
       </w:pPr>
       <w:r>
         <w:rPr>
-          <w:rFonts w:ascii="Georgia" w:hAnsi="Georgia"/>
+          <w:rFonts w:ascii="Times New Roman" w:hAnsi="Times New Roman"/>
           <w:sz w:val="20"/>
         </w:rPr>
         <w:t xml:space="preserve">41. </w:t>
@@ -10021,7 +10021,7 @@
       </w:pPr>
       <w:r>
         <w:rPr>
-          <w:rFonts w:ascii="Georgia" w:hAnsi="Georgia"/>
+          <w:rFonts w:ascii="Times New Roman" w:hAnsi="Times New Roman"/>
           <w:sz w:val="20"/>
         </w:rPr>
         <w:t xml:space="preserve">42. </w:t>
@@ -10055,7 +10055,7 @@
       </w:pPr>
       <w:r>
         <w:rPr>
-          <w:rFonts w:ascii="Georgia" w:hAnsi="Georgia"/>
+          <w:rFonts w:ascii="Times New Roman" w:hAnsi="Times New Roman"/>
           <w:sz w:val="20"/>
         </w:rPr>
         <w:t xml:space="preserve">43. </w:t>
@@ -10089,7 +10089,7 @@
       </w:pPr>
       <w:r>
         <w:rPr>
-          <w:rFonts w:ascii="Georgia" w:hAnsi="Georgia"/>
+          <w:rFonts w:ascii="Times New Roman" w:hAnsi="Times New Roman"/>
           <w:sz w:val="20"/>
         </w:rPr>
         <w:t xml:space="preserve">44. </w:t>
@@ -10123,7 +10123,7 @@
       </w:pPr>
       <w:r>
         <w:rPr>
-          <w:rFonts w:ascii="Georgia" w:hAnsi="Georgia"/>
+          <w:rFonts w:ascii="Times New Roman" w:hAnsi="Times New Roman"/>
           <w:sz w:val="20"/>
         </w:rPr>
         <w:t xml:space="preserve">45. </w:t>
@@ -10157,7 +10157,7 @@
       </w:pPr>
       <w:r>
         <w:rPr>
-          <w:rFonts w:ascii="Georgia" w:hAnsi="Georgia"/>
+          <w:rFonts w:ascii="Times New Roman" w:hAnsi="Times New Roman"/>
           <w:sz w:val="20"/>
         </w:rPr>
         <w:t xml:space="preserve">46. </w:t>
@@ -10191,7 +10191,7 @@
       </w:pPr>
       <w:r>
         <w:rPr>
-          <w:rFonts w:ascii="Georgia" w:hAnsi="Georgia"/>
+          <w:rFonts w:ascii="Times New Roman" w:hAnsi="Times New Roman"/>
           <w:sz w:val="20"/>
         </w:rPr>
         <w:t xml:space="preserve">47. </w:t>
@@ -10212,7 +10212,7 @@
       </w:pPr>
       <w:r>
         <w:rPr>
-          <w:rFonts w:ascii="Georgia" w:hAnsi="Georgia"/>
+          <w:rFonts w:ascii="Times New Roman" w:hAnsi="Times New Roman"/>
           <w:sz w:val="20"/>
         </w:rPr>
         <w:t xml:space="preserve">48. </w:t>
@@ -10246,7 +10246,7 @@
       </w:pPr>
       <w:r>
         <w:rPr>
-          <w:rFonts w:ascii="Georgia" w:hAnsi="Georgia"/>
+          <w:rFonts w:ascii="Times New Roman" w:hAnsi="Times New Roman"/>
           <w:sz w:val="20"/>
         </w:rPr>
         <w:t xml:space="preserve">49. </w:t>
@@ -10280,7 +10280,7 @@
       </w:pPr>
       <w:r>
         <w:rPr>
-          <w:rFonts w:ascii="Georgia" w:hAnsi="Georgia"/>
+          <w:rFonts w:ascii="Times New Roman" w:hAnsi="Times New Roman"/>
           <w:sz w:val="20"/>
         </w:rPr>
         <w:t xml:space="preserve">50. </w:t>
@@ -10314,7 +10314,7 @@
       </w:pPr>
       <w:r>
         <w:rPr>
-          <w:rFonts w:ascii="Georgia" w:hAnsi="Georgia"/>
+          <w:rFonts w:ascii="Times New Roman" w:hAnsi="Times New Roman"/>
           <w:sz w:val="20"/>
         </w:rPr>
         <w:t xml:space="preserve">51. </w:t>
@@ -10348,7 +10348,7 @@
       </w:pPr>
       <w:r>
         <w:rPr>
-          <w:rFonts w:ascii="Georgia" w:hAnsi="Georgia"/>
+          <w:rFonts w:ascii="Times New Roman" w:hAnsi="Times New Roman"/>
           <w:sz w:val="20"/>
         </w:rPr>
         <w:t xml:space="preserve">52. </w:t>
@@ -10382,7 +10382,7 @@
       </w:pPr>
       <w:r>
         <w:rPr>
-          <w:rFonts w:ascii="Georgia" w:hAnsi="Georgia"/>
+          <w:rFonts w:ascii="Times New Roman" w:hAnsi="Times New Roman"/>
           <w:sz w:val="20"/>
         </w:rPr>
         <w:t xml:space="preserve">53. </w:t>
@@ -10416,7 +10416,7 @@
       </w:pPr>
       <w:r>
         <w:rPr>
-          <w:rFonts w:ascii="Georgia" w:hAnsi="Georgia"/>
+          <w:rFonts w:ascii="Times New Roman" w:hAnsi="Times New Roman"/>
           <w:sz w:val="20"/>
         </w:rPr>
         <w:t xml:space="preserve">54. </w:t>
@@ -10450,7 +10450,7 @@
       </w:pPr>
       <w:r>
         <w:rPr>
-          <w:rFonts w:ascii="Georgia" w:hAnsi="Georgia"/>
+          <w:rFonts w:ascii="Times New Roman" w:hAnsi="Times New Roman"/>
           <w:sz w:val="20"/>
         </w:rPr>
         <w:t xml:space="preserve">55. </w:t>
@@ -10484,7 +10484,7 @@
       </w:pPr>
       <w:r>
         <w:rPr>
-          <w:rFonts w:ascii="Georgia" w:hAnsi="Georgia"/>
+          <w:rFonts w:ascii="Times New Roman" w:hAnsi="Times New Roman"/>
           <w:sz w:val="20"/>
         </w:rPr>
         <w:t xml:space="preserve">56. </w:t>
@@ -10518,7 +10518,7 @@
       </w:pPr>
       <w:r>
         <w:rPr>
-          <w:rFonts w:ascii="Georgia" w:hAnsi="Georgia"/>
+          <w:rFonts w:ascii="Times New Roman" w:hAnsi="Times New Roman"/>
           <w:sz w:val="20"/>
         </w:rPr>
         <w:t xml:space="preserve">57. </w:t>
@@ -10539,7 +10539,7 @@
       </w:pPr>
       <w:r>
         <w:rPr>
-          <w:rFonts w:ascii="Georgia" w:hAnsi="Georgia"/>
+          <w:rFonts w:ascii="Times New Roman" w:hAnsi="Times New Roman"/>
           <w:sz w:val="20"/>
         </w:rPr>
         <w:t xml:space="preserve">58. </w:t>
@@ -10573,7 +10573,7 @@
       </w:pPr>
       <w:r>
         <w:rPr>
-          <w:rFonts w:ascii="Georgia" w:hAnsi="Georgia"/>
+          <w:rFonts w:ascii="Times New Roman" w:hAnsi="Times New Roman"/>
           <w:sz w:val="20"/>
         </w:rPr>
         <w:t xml:space="preserve">59. </w:t>
@@ -10594,7 +10594,7 @@
       </w:pPr>
       <w:r>
         <w:rPr>
-          <w:rFonts w:ascii="Georgia" w:hAnsi="Georgia"/>
+          <w:rFonts w:ascii="Times New Roman" w:hAnsi="Times New Roman"/>
           <w:sz w:val="20"/>
         </w:rPr>
         <w:t xml:space="preserve">60. </w:t>
@@ -10631,7 +10631,7 @@
       </w:pPr>
       <w:r>
         <w:rPr>
-          <w:rFonts w:ascii="Georgia" w:hAnsi="Georgia"/>
+          <w:rFonts w:ascii="Times New Roman" w:hAnsi="Times New Roman"/>
           <w:sz w:val="20"/>
         </w:rPr>
         <w:t xml:space="preserve">61. </w:t>
@@ -10665,7 +10665,7 @@
       </w:pPr>
       <w:r>
         <w:rPr>
-          <w:rFonts w:ascii="Georgia" w:hAnsi="Georgia"/>
+          <w:rFonts w:ascii="Times New Roman" w:hAnsi="Times New Roman"/>
           <w:sz w:val="20"/>
         </w:rPr>
         <w:t xml:space="preserve">62. </w:t>
@@ -10699,7 +10699,7 @@
       </w:pPr>
       <w:r>
         <w:rPr>
-          <w:rFonts w:ascii="Georgia" w:hAnsi="Georgia"/>
+          <w:rFonts w:ascii="Times New Roman" w:hAnsi="Times New Roman"/>
           <w:sz w:val="20"/>
         </w:rPr>
         <w:t xml:space="preserve">63. </w:t>
@@ -10733,7 +10733,7 @@
       </w:pPr>
       <w:r>
         <w:rPr>
-          <w:rFonts w:ascii="Georgia" w:hAnsi="Georgia"/>
+          <w:rFonts w:ascii="Times New Roman" w:hAnsi="Times New Roman"/>
           <w:sz w:val="20"/>
         </w:rPr>
         <w:t xml:space="preserve">64. </w:t>
@@ -10767,7 +10767,7 @@
       </w:pPr>
       <w:r>
         <w:rPr>
-          <w:rFonts w:ascii="Georgia" w:hAnsi="Georgia"/>
+          <w:rFonts w:ascii="Times New Roman" w:hAnsi="Times New Roman"/>
           <w:sz w:val="20"/>
         </w:rPr>
         <w:t xml:space="preserve">65. </w:t>
@@ -10801,7 +10801,7 @@
       </w:pPr>
       <w:r>
         <w:rPr>
-          <w:rFonts w:ascii="Georgia" w:hAnsi="Georgia"/>
+          <w:rFonts w:ascii="Times New Roman" w:hAnsi="Times New Roman"/>
           <w:sz w:val="20"/>
         </w:rPr>
         <w:t xml:space="preserve">66. </w:t>
@@ -10850,7 +10850,7 @@
     </w:pPr>
     <w:r>
       <w:rPr>
-        <w:rFonts w:ascii="Georgia" w:hAnsi="Georgia"/>
+        <w:rFonts w:ascii="Times New Roman" w:hAnsi="Times New Roman"/>
         <w:sz w:val="20"/>
       </w:rPr>
       <w:fldChar w:fldCharType="begin"/>
@@ -11553,13 +11553,13 @@
     <w:rsid w:val="00FC693F"/>
     <w:pPr>
       <w:keepNext w:val="0"/>
-      <w:spacing w:after="0" w:before="0" w:line="360" w:lineRule="auto"/>
+      <w:spacing w:after="0" w:before="0" w:line="480" w:lineRule="auto"/>
     </w:pPr>
     <w:rPr>
-      <w:rFonts w:ascii="Georgia" w:hAnsi="Georgia"/>
+      <w:rFonts w:ascii="Times New Roman" w:hAnsi="Times New Roman"/>
       <w:b w:val="0"/>
       <w:i w:val="0"/>
-      <w:sz w:val="22"/>
+      <w:sz w:val="24"/>
     </w:rPr>
   </w:style>
   <w:style w:styleId="Header" w:type="paragraph">
@@ -11621,7 +11621,7 @@
       <w:outlineLvl w:val="0"/>
     </w:pPr>
     <w:rPr>
-      <w:rFonts w:ascii="Georgia" w:asciiTheme="majorHAnsi" w:cstheme="majorBidi" w:eastAsiaTheme="majorEastAsia" w:hAnsi="Georgia" w:hAnsiTheme="majorHAnsi"/>
+      <w:rFonts w:ascii="Times New Roman" w:asciiTheme="majorHAnsi" w:cstheme="majorBidi" w:eastAsiaTheme="majorEastAsia" w:hAnsi="Times New Roman" w:hAnsiTheme="majorHAnsi"/>
       <w:b/>
       <w:bCs/>
       <w:i w:val="0"/>
@@ -11646,7 +11646,7 @@
       <w:outlineLvl w:val="1"/>
     </w:pPr>
     <w:rPr>
-      <w:rFonts w:ascii="Georgia" w:asciiTheme="majorHAnsi" w:cstheme="majorBidi" w:eastAsiaTheme="majorEastAsia" w:hAnsi="Georgia" w:hAnsiTheme="majorHAnsi"/>
+      <w:rFonts w:ascii="Times New Roman" w:asciiTheme="majorHAnsi" w:cstheme="majorBidi" w:eastAsiaTheme="majorEastAsia" w:hAnsi="Times New Roman" w:hAnsiTheme="majorHAnsi"/>
       <w:b/>
       <w:bCs/>
       <w:i w:val="0"/>
@@ -11671,7 +11671,7 @@
       <w:outlineLvl w:val="2"/>
     </w:pPr>
     <w:rPr>
-      <w:rFonts w:ascii="Georgia" w:asciiTheme="majorHAnsi" w:cstheme="majorBidi" w:eastAsiaTheme="majorEastAsia" w:hAnsi="Georgia" w:hAnsiTheme="majorHAnsi"/>
+      <w:rFonts w:ascii="Times New Roman" w:asciiTheme="majorHAnsi" w:cstheme="majorBidi" w:eastAsiaTheme="majorEastAsia" w:hAnsi="Times New Roman" w:hAnsiTheme="majorHAnsi"/>
       <w:b/>
       <w:bCs/>
       <w:i w:val="0"/>
@@ -11916,7 +11916,7 @@
       <w:jc w:val="center"/>
     </w:pPr>
     <w:rPr>
-      <w:rFonts w:ascii="Georgia" w:asciiTheme="majorHAnsi" w:cstheme="majorBidi" w:eastAsiaTheme="majorEastAsia" w:hAnsi="Georgia" w:hAnsiTheme="majorHAnsi"/>
+      <w:rFonts w:ascii="Times New Roman" w:asciiTheme="majorHAnsi" w:cstheme="majorBidi" w:eastAsiaTheme="majorEastAsia" w:hAnsi="Times New Roman" w:hAnsiTheme="majorHAnsi"/>
       <w:b/>
       <w:i w:val="0"/>
       <w:color w:themeColor="text2" w:themeShade="BF" w:val="17365D"/>
@@ -11958,7 +11958,7 @@
       <w:jc w:val="center"/>
     </w:pPr>
     <w:rPr>
-      <w:rFonts w:ascii="Georgia" w:asciiTheme="majorHAnsi" w:cstheme="majorBidi" w:eastAsiaTheme="majorEastAsia" w:hAnsi="Georgia" w:hAnsiTheme="majorHAnsi"/>
+      <w:rFonts w:ascii="Times New Roman" w:asciiTheme="majorHAnsi" w:cstheme="majorBidi" w:eastAsiaTheme="majorEastAsia" w:hAnsi="Times New Roman" w:hAnsiTheme="majorHAnsi"/>
       <w:b w:val="0"/>
       <w:i w:val="0"/>
       <w:iCs/>
@@ -12004,15 +12004,15 @@
     <w:rsid w:val="00AA1D8D"/>
     <w:pPr>
       <w:keepNext w:val="0"/>
-      <w:spacing w:after="0" w:before="0" w:line="360" w:lineRule="auto"/>
+      <w:spacing w:after="0" w:before="0" w:line="480" w:lineRule="auto"/>
       <w:ind w:firstLine="720"/>
       <w:jc w:val="both"/>
     </w:pPr>
     <w:rPr>
-      <w:rFonts w:ascii="Georgia" w:hAnsi="Georgia"/>
+      <w:rFonts w:ascii="Times New Roman" w:hAnsi="Times New Roman"/>
       <w:b w:val="0"/>
       <w:i w:val="0"/>
-      <w:sz w:val="22"/>
+      <w:sz w:val="24"/>
     </w:rPr>
   </w:style>
   <w:style w:customStyle="1" w:styleId="BodyTextChar" w:type="character">
@@ -23270,15 +23270,15 @@
     <w:basedOn w:val="BodyText"/>
     <w:pPr>
       <w:keepNext w:val="0"/>
-      <w:spacing w:after="0" w:before="0" w:line="360" w:lineRule="auto"/>
+      <w:spacing w:after="0" w:before="0" w:line="480" w:lineRule="auto"/>
       <w:ind w:firstLine="0"/>
       <w:jc w:val="both"/>
     </w:pPr>
     <w:rPr>
-      <w:rFonts w:ascii="Georgia" w:hAnsi="Georgia"/>
+      <w:rFonts w:ascii="Times New Roman" w:hAnsi="Times New Roman"/>
       <w:b w:val="0"/>
       <w:i w:val="0"/>
-      <w:sz w:val="22"/>
+      <w:sz w:val="24"/>
     </w:rPr>
   </w:style>
   <w:style w:customStyle="1" w:styleId="Compact" w:type="paragraph">
@@ -23291,10 +23291,10 @@
       <w:jc w:val="both"/>
     </w:pPr>
     <w:rPr>
-      <w:rFonts w:ascii="Georgia" w:hAnsi="Georgia"/>
+      <w:rFonts w:ascii="Times New Roman" w:hAnsi="Times New Roman"/>
       <w:b w:val="0"/>
       <w:i w:val="0"/>
-      <w:sz w:val="22"/>
+      <w:sz w:val="24"/>
     </w:rPr>
   </w:style>
   <w:style w:customStyle="1" w:styleId="AbstractLabel" w:type="paragraph">
@@ -23307,10 +23307,10 @@
       <w:jc w:val="center"/>
     </w:pPr>
     <w:rPr>
-      <w:rFonts w:ascii="Georgia" w:hAnsi="Georgia"/>
+      <w:rFonts w:ascii="Times New Roman" w:hAnsi="Times New Roman"/>
       <w:b/>
       <w:i w:val="0"/>
-      <w:sz w:val="22"/>
+      <w:sz w:val="24"/>
     </w:rPr>
   </w:style>
   <w:style w:customStyle="1" w:styleId="Keywords" w:type="paragraph">
@@ -23323,10 +23323,10 @@
       <w:jc w:val="both"/>
     </w:pPr>
     <w:rPr>
-      <w:rFonts w:ascii="Georgia" w:hAnsi="Georgia"/>
+      <w:rFonts w:ascii="Times New Roman" w:hAnsi="Times New Roman"/>
       <w:b w:val="0"/>
       <w:i w:val="0"/>
-      <w:sz w:val="22"/>
+      <w:sz w:val="24"/>
     </w:rPr>
   </w:style>
   <w:style w:customStyle="1" w:styleId="ImageCaption" w:type="paragraph">
@@ -23338,7 +23338,7 @@
       <w:jc w:val="center"/>
     </w:pPr>
     <w:rPr>
-      <w:rFonts w:ascii="Georgia" w:hAnsi="Georgia"/>
+      <w:rFonts w:ascii="Times New Roman" w:hAnsi="Times New Roman"/>
       <w:b w:val="0"/>
       <w:i/>
       <w:sz w:val="20"/>
@@ -23353,7 +23353,7 @@
       <w:jc w:val="center"/>
     </w:pPr>
     <w:rPr>
-      <w:rFonts w:ascii="Georgia" w:hAnsi="Georgia"/>
+      <w:rFonts w:ascii="Times New Roman" w:hAnsi="Times New Roman"/>
       <w:b w:val="0"/>
       <w:i/>
       <w:sz w:val="20"/>
@@ -23367,7 +23367,7 @@
       <w:spacing w:after="120" w:before="240"/>
     </w:pPr>
     <w:rPr>
-      <w:rFonts w:ascii="Georgia" w:hAnsi="Georgia"/>
+      <w:rFonts w:ascii="Times New Roman" w:hAnsi="Times New Roman"/>
       <w:b/>
       <w:i w:val="0"/>
       <w:sz w:val="28"/>
@@ -23383,7 +23383,7 @@
       <w:jc w:val="left"/>
     </w:pPr>
     <w:rPr>
-      <w:rFonts w:ascii="Georgia" w:hAnsi="Georgia"/>
+      <w:rFonts w:ascii="Times New Roman" w:hAnsi="Times New Roman"/>
       <w:b w:val="0"/>
       <w:i w:val="0"/>
       <w:sz w:val="20"/>

</xml_diff>